<commit_message>
feat: letterhead design D · Schwung as the default (D-071)
Founder asked for a more elegant, more beautiful letterhead. Six directions
were drawn in parallel; Schwung won: a light page, nine exactly parallel
curves sweeping in from the top-right corner with one in signal, a smaller
echo bottom-left, the lockup in its chip with the tagline in Archivo Light
and the offers under it, contacts in two columns on the info-block axis.
Only line ends bleed, so it prints on an office printer. A, B, C stay as
one-word alternatives.

Co-Authored-By: Claude Opus 5.5 <noreply@anthropic.com>
Claude-Session: https://claude.ai/code/session_01QKsjxP8vXYfeQFGbQt9pt5
</commit_message>
<xml_diff>
--- a/print/brief/NexBridge-IT_Briefbogen.docx
+++ b/print/brief/NexBridge-IT_Briefbogen.docx
@@ -405,7 +405,7 @@
       <w:footerReference w:type="default" r:id="rId9"/>
       <w:footerReference w:type="first" r:id="rId10"/>
       <w:pgSz w:w="11906" w:h="16838" w:orient="portrait"/>
-      <w:pgMar w:top="2551" w:right="1134" w:bottom="1247" w:left="1417" w:header="510" w:footer="454" w:gutter="0"/>
+      <w:pgMar w:top="2551" w:right="1134" w:bottom="1247" w:left="1417" w:header="1332" w:footer="454" w:gutter="0"/>
       <w:pgNumType/>
       <w:titlePg/>
       <w:docGrid w:linePitch="360"/>
@@ -526,7 +526,7 @@
           <wp:extent cx="7560000" cy="10692000"/>
           <wp:effectExtent t="0" r="0" b="0" l="0"/>
           <wp:wrapNone/>
-          <wp:docPr id="1" name="graphitband-folgeseite" descr="Kopf und Fußzeile der Folgeseiten NexBridge-IT" title="NexBridge-IT"/>
+          <wp:docPr id="1" name="schwung-folgeseite" descr="Kopf und Fußzeile der Folgeseiten NexBridge-IT" title="NexBridge-IT"/>
           <wp:cNvGraphicFramePr>
             <a:graphicFrameLocks xmlns:a="http://schemas.openxmlformats.org/drawingml/2006/main" noChangeAspect="1"/>
           </wp:cNvGraphicFramePr>
@@ -569,7 +569,7 @@
     </w:r>
     <w:r>
       <w:rPr>
-        <w:color w:val="8B959E"/>
+        <w:color w:val="5B6770"/>
         <w:sz w:val="15"/>
         <w:szCs w:val="15"/>
       </w:rPr>
@@ -577,7 +577,7 @@
     </w:r>
     <w:r>
       <w:rPr>
-        <w:color w:val="8B959E"/>
+        <w:color w:val="5B6770"/>
         <w:sz w:val="15"/>
         <w:szCs w:val="15"/>
       </w:rPr>
@@ -585,7 +585,7 @@
     </w:r>
     <w:r>
       <w:rPr>
-        <w:color w:val="8B959E"/>
+        <w:color w:val="5B6770"/>
         <w:sz w:val="15"/>
         <w:szCs w:val="15"/>
       </w:rPr>
@@ -593,7 +593,7 @@
     </w:r>
     <w:r>
       <w:rPr>
-        <w:color w:val="8B959E"/>
+        <w:color w:val="5B6770"/>
         <w:sz w:val="15"/>
         <w:szCs w:val="15"/>
       </w:rPr>
@@ -601,7 +601,7 @@
     </w:r>
     <w:r>
       <w:rPr>
-        <w:color w:val="8B959E"/>
+        <w:color w:val="5B6770"/>
         <w:sz w:val="15"/>
         <w:szCs w:val="15"/>
       </w:rPr>
@@ -609,7 +609,7 @@
     </w:r>
     <w:r>
       <w:rPr>
-        <w:color w:val="8B959E"/>
+        <w:color w:val="5B6770"/>
         <w:sz w:val="15"/>
         <w:szCs w:val="15"/>
       </w:rPr>
@@ -617,7 +617,7 @@
     </w:r>
     <w:r>
       <w:rPr>
-        <w:color w:val="8B959E"/>
+        <w:color w:val="5B6770"/>
         <w:sz w:val="15"/>
         <w:szCs w:val="15"/>
       </w:rPr>
@@ -625,7 +625,7 @@
     </w:r>
     <w:r>
       <w:rPr>
-        <w:color w:val="8B959E"/>
+        <w:color w:val="5B6770"/>
         <w:sz w:val="15"/>
         <w:szCs w:val="15"/>
       </w:rPr>
@@ -633,7 +633,7 @@
     </w:r>
     <w:r>
       <w:rPr>
-        <w:color w:val="8B959E"/>
+        <w:color w:val="5B6770"/>
         <w:sz w:val="15"/>
         <w:szCs w:val="15"/>
       </w:rPr>
@@ -641,7 +641,7 @@
     </w:r>
     <w:r>
       <w:rPr>
-        <w:color w:val="8B959E"/>
+        <w:color w:val="5B6770"/>
         <w:sz w:val="15"/>
         <w:szCs w:val="15"/>
       </w:rPr>
@@ -649,7 +649,7 @@
     </w:r>
     <w:r>
       <w:rPr>
-        <w:color w:val="8B959E"/>
+        <w:color w:val="5B6770"/>
         <w:sz w:val="15"/>
         <w:szCs w:val="15"/>
       </w:rPr>
@@ -657,7 +657,7 @@
     </w:r>
     <w:r>
       <w:rPr>
-        <w:color w:val="8B959E"/>
+        <w:color w:val="5B6770"/>
         <w:sz w:val="15"/>
         <w:szCs w:val="15"/>
       </w:rPr>
@@ -665,7 +665,7 @@
     </w:r>
     <w:r>
       <w:rPr>
-        <w:color w:val="8B959E"/>
+        <w:color w:val="5B6770"/>
         <w:sz w:val="15"/>
         <w:szCs w:val="15"/>
       </w:rPr>
@@ -697,7 +697,7 @@
           <wp:extent cx="7560000" cy="10692000"/>
           <wp:effectExtent t="0" r="0" b="0" l="0"/>
           <wp:wrapNone/>
-          <wp:docPr id="1" name="graphitband-seite1" descr="Briefkopf und Fußzeile NexBridge-IT mit Falz- und Lochmarken" title="NexBridge-IT"/>
+          <wp:docPr id="1" name="schwung-seite1" descr="Briefkopf und Fußzeile NexBridge-IT mit Falz- und Lochmarken" title="NexBridge-IT"/>
           <wp:cNvGraphicFramePr>
             <a:graphicFrameLocks xmlns:a="http://schemas.openxmlformats.org/drawingml/2006/main" noChangeAspect="1"/>
           </wp:cNvGraphicFramePr>

</xml_diff>

<commit_message>
feat: letterhead design E · Nocturne as the default (D-071)
The founder picked Nocturne from the six drafts: a slim graphite band lit
slightly from above, the tagline on the wordmark baseline, three steel
hairlines that fade in, converge and hand over to a thin signal line
running off the right edge with the offers on it, and a light footer
with a signal tick. Ported byte-identical from the draft. D · Schwung
stays as an alternative with A, B and C.

Co-Authored-By: Claude Opus 5.5 <noreply@anthropic.com>
Claude-Session: https://claude.ai/code/session_01QKsjxP8vXYfeQFGbQt9pt5
</commit_message>
<xml_diff>
--- a/print/brief/NexBridge-IT_Briefbogen.docx
+++ b/print/brief/NexBridge-IT_Briefbogen.docx
@@ -405,7 +405,7 @@
       <w:footerReference w:type="default" r:id="rId9"/>
       <w:footerReference w:type="first" r:id="rId10"/>
       <w:pgSz w:w="11906" w:h="16838" w:orient="portrait"/>
-      <w:pgMar w:top="2551" w:right="1134" w:bottom="1247" w:left="1417" w:header="1332" w:footer="454" w:gutter="0"/>
+      <w:pgMar w:top="2551" w:right="1134" w:bottom="1247" w:left="1417" w:header="411" w:footer="454" w:gutter="0"/>
       <w:pgNumType/>
       <w:titlePg/>
       <w:docGrid w:linePitch="360"/>
@@ -526,7 +526,7 @@
           <wp:extent cx="7560000" cy="10692000"/>
           <wp:effectExtent t="0" r="0" b="0" l="0"/>
           <wp:wrapNone/>
-          <wp:docPr id="1" name="schwung-folgeseite" descr="Kopf und Fußzeile der Folgeseiten NexBridge-IT" title="NexBridge-IT"/>
+          <wp:docPr id="1" name="nocturne-folgeseite" descr="Kopf und Fußzeile der Folgeseiten NexBridge-IT" title="NexBridge-IT"/>
           <wp:cNvGraphicFramePr>
             <a:graphicFrameLocks xmlns:a="http://schemas.openxmlformats.org/drawingml/2006/main" noChangeAspect="1"/>
           </wp:cNvGraphicFramePr>
@@ -569,7 +569,7 @@
     </w:r>
     <w:r>
       <w:rPr>
-        <w:color w:val="5B6770"/>
+        <w:color w:val="8B959E"/>
         <w:sz w:val="15"/>
         <w:szCs w:val="15"/>
       </w:rPr>
@@ -577,7 +577,7 @@
     </w:r>
     <w:r>
       <w:rPr>
-        <w:color w:val="5B6770"/>
+        <w:color w:val="8B959E"/>
         <w:sz w:val="15"/>
         <w:szCs w:val="15"/>
       </w:rPr>
@@ -585,7 +585,7 @@
     </w:r>
     <w:r>
       <w:rPr>
-        <w:color w:val="5B6770"/>
+        <w:color w:val="8B959E"/>
         <w:sz w:val="15"/>
         <w:szCs w:val="15"/>
       </w:rPr>
@@ -593,7 +593,7 @@
     </w:r>
     <w:r>
       <w:rPr>
-        <w:color w:val="5B6770"/>
+        <w:color w:val="8B959E"/>
         <w:sz w:val="15"/>
         <w:szCs w:val="15"/>
       </w:rPr>
@@ -601,7 +601,7 @@
     </w:r>
     <w:r>
       <w:rPr>
-        <w:color w:val="5B6770"/>
+        <w:color w:val="8B959E"/>
         <w:sz w:val="15"/>
         <w:szCs w:val="15"/>
       </w:rPr>
@@ -609,7 +609,7 @@
     </w:r>
     <w:r>
       <w:rPr>
-        <w:color w:val="5B6770"/>
+        <w:color w:val="8B959E"/>
         <w:sz w:val="15"/>
         <w:szCs w:val="15"/>
       </w:rPr>
@@ -617,7 +617,7 @@
     </w:r>
     <w:r>
       <w:rPr>
-        <w:color w:val="5B6770"/>
+        <w:color w:val="8B959E"/>
         <w:sz w:val="15"/>
         <w:szCs w:val="15"/>
       </w:rPr>
@@ -625,7 +625,7 @@
     </w:r>
     <w:r>
       <w:rPr>
-        <w:color w:val="5B6770"/>
+        <w:color w:val="8B959E"/>
         <w:sz w:val="15"/>
         <w:szCs w:val="15"/>
       </w:rPr>
@@ -633,7 +633,7 @@
     </w:r>
     <w:r>
       <w:rPr>
-        <w:color w:val="5B6770"/>
+        <w:color w:val="8B959E"/>
         <w:sz w:val="15"/>
         <w:szCs w:val="15"/>
       </w:rPr>
@@ -641,7 +641,7 @@
     </w:r>
     <w:r>
       <w:rPr>
-        <w:color w:val="5B6770"/>
+        <w:color w:val="8B959E"/>
         <w:sz w:val="15"/>
         <w:szCs w:val="15"/>
       </w:rPr>
@@ -649,7 +649,7 @@
     </w:r>
     <w:r>
       <w:rPr>
-        <w:color w:val="5B6770"/>
+        <w:color w:val="8B959E"/>
         <w:sz w:val="15"/>
         <w:szCs w:val="15"/>
       </w:rPr>
@@ -657,7 +657,7 @@
     </w:r>
     <w:r>
       <w:rPr>
-        <w:color w:val="5B6770"/>
+        <w:color w:val="8B959E"/>
         <w:sz w:val="15"/>
         <w:szCs w:val="15"/>
       </w:rPr>
@@ -665,7 +665,7 @@
     </w:r>
     <w:r>
       <w:rPr>
-        <w:color w:val="5B6770"/>
+        <w:color w:val="8B959E"/>
         <w:sz w:val="15"/>
         <w:szCs w:val="15"/>
       </w:rPr>
@@ -697,7 +697,7 @@
           <wp:extent cx="7560000" cy="10692000"/>
           <wp:effectExtent t="0" r="0" b="0" l="0"/>
           <wp:wrapNone/>
-          <wp:docPr id="1" name="schwung-seite1" descr="Briefkopf und Fußzeile NexBridge-IT mit Falz- und Lochmarken" title="NexBridge-IT"/>
+          <wp:docPr id="1" name="nocturne-seite1" descr="Briefkopf und Fußzeile NexBridge-IT mit Falz- und Lochmarken" title="NexBridge-IT"/>
           <wp:cNvGraphicFramePr>
             <a:graphicFrameLocks xmlns:a="http://schemas.openxmlformats.org/drawingml/2006/main" noChangeAspect="1"/>
           </wp:cNvGraphicFramePr>

</xml_diff>

<commit_message>
fix: letterhead band no longer looks washed out on screen (D-071)
Word and Apple's preview draw header content dimmed while the body is
edited, so page 1's artwork moves from the first-page header into the body,
anchored to the page behind the text (top margin 1 pt short of 45 mm pays
for the anchor line, so the address field still starts at 45 mm). Follow
pages keep theirs in the header. For viewers that ignore embedded fonts and
column widths: the font table now says "swiss" so they fall back to a sans,
the info block is offset by a cell margin instead of an empty spacer column,
and the second signature sits on a tab stop instead of a table column.
Positions measured unchanged in LibreOffice.

Co-Authored-By: Claude Opus 5.5 <noreply@anthropic.com>
Claude-Session: https://claude.ai/code/session_01QKsjxP8vXYfeQFGbQt9pt5
</commit_message>
<xml_diff>
--- a/print/brief/NexBridge-IT_Briefbogen.docx
+++ b/print/brief/NexBridge-IT_Briefbogen.docx
@@ -2,6 +2,65 @@
 <file path=word/document.xml><?xml version="1.0" encoding="utf-8"?>
 <w:document xmlns:wpc="http://schemas.microsoft.com/office/word/2010/wordprocessingCanvas" xmlns:mc="http://schemas.openxmlformats.org/markup-compatibility/2006" xmlns:o="urn:schemas-microsoft-com:office:office" xmlns:r="http://schemas.openxmlformats.org/officeDocument/2006/relationships" xmlns:m="http://schemas.openxmlformats.org/officeDocument/2006/math" xmlns:v="urn:schemas-microsoft-com:vml" xmlns:wp14="http://schemas.microsoft.com/office/word/2010/wordprocessingDrawing" xmlns:wp="http://schemas.openxmlformats.org/drawingml/2006/wordprocessingDrawing" xmlns:w10="urn:schemas-microsoft-com:office:word" xmlns:w="http://schemas.openxmlformats.org/wordprocessingml/2006/main" xmlns:w14="http://schemas.microsoft.com/office/word/2010/wordml" xmlns:w15="http://schemas.microsoft.com/office/word/2012/wordml" xmlns:wpg="http://schemas.microsoft.com/office/word/2010/wordprocessingGroup" xmlns:wpi="http://schemas.microsoft.com/office/word/2010/wordprocessingInk" xmlns:wne="http://schemas.microsoft.com/office/word/2006/wordml" xmlns:wps="http://schemas.microsoft.com/office/word/2010/wordprocessingShape" xmlns:cx="http://schemas.microsoft.com/office/drawing/2014/chartex" xmlns:cx1="http://schemas.microsoft.com/office/drawing/2015/9/8/chartex" xmlns:cx2="http://schemas.microsoft.com/office/drawing/2015/10/21/chartex" xmlns:cx3="http://schemas.microsoft.com/office/drawing/2016/5/9/chartex" xmlns:cx4="http://schemas.microsoft.com/office/drawing/2016/5/10/chartex" xmlns:cx5="http://schemas.microsoft.com/office/drawing/2016/5/11/chartex" xmlns:cx6="http://schemas.microsoft.com/office/drawing/2016/5/12/chartex" xmlns:cx7="http://schemas.microsoft.com/office/drawing/2016/5/13/chartex" xmlns:cx8="http://schemas.microsoft.com/office/drawing/2016/5/14/chartex" xmlns:aink="http://schemas.microsoft.com/office/drawing/2016/ink" xmlns:am3d="http://schemas.microsoft.com/office/drawing/2017/model3d" xmlns:w16cex="http://schemas.microsoft.com/office/word/2018/wordml/cex" xmlns:w16cid="http://schemas.microsoft.com/office/word/2016/wordml/cid" xmlns:w16="http://schemas.microsoft.com/office/word/2018/wordml" xmlns:w16sdtdh="http://schemas.microsoft.com/office/word/2020/wordml/sdtdatahash" xmlns:w16se="http://schemas.microsoft.com/office/word/2015/wordml/symex" mc:Ignorable="w14 w15 wp14">
   <w:body>
+    <w:p>
+      <w:pPr>
+        <w:spacing w:after="0" w:before="0" w:line="20" w:lineRule="exact"/>
+      </w:pPr>
+      <w:r>
+        <w:drawing>
+          <wp:anchor distT="0" distB="0" distL="0" distR="0" simplePos="0" allowOverlap="1" behindDoc="1" locked="1" layoutInCell="1" relativeHeight="10692000">
+            <wp:simplePos x="0" y="0"/>
+            <wp:positionH relativeFrom="page">
+              <wp:posOffset>0</wp:posOffset>
+            </wp:positionH>
+            <wp:positionV relativeFrom="page">
+              <wp:posOffset>0</wp:posOffset>
+            </wp:positionV>
+            <wp:extent cx="7560000" cy="10692000"/>
+            <wp:effectExtent t="0" r="0" b="0" l="0"/>
+            <wp:wrapNone/>
+            <wp:docPr id="1" name="nocturne-seite1" descr="Briefkopf und Fußzeile NexBridge-IT mit Falz- und Lochmarken" title="NexBridge-IT"/>
+            <wp:cNvGraphicFramePr>
+              <a:graphicFrameLocks xmlns:a="http://schemas.openxmlformats.org/drawingml/2006/main" noChangeAspect="1"/>
+            </wp:cNvGraphicFramePr>
+            <a:graphic xmlns:a="http://schemas.openxmlformats.org/drawingml/2006/main">
+              <a:graphicData uri="http://schemas.openxmlformats.org/drawingml/2006/picture">
+                <pic:pic xmlns:pic="http://schemas.openxmlformats.org/drawingml/2006/picture">
+                  <pic:nvPicPr>
+                    <pic:cNvPr id="0" name="" descr=""/>
+                    <pic:cNvPicPr>
+                      <a:picLocks noChangeAspect="1" noChangeArrowheads="1"/>
+                    </pic:cNvPicPr>
+                  </pic:nvPicPr>
+                  <pic:blipFill>
+                    <a:blip r:embed="rId12" cstate="none">
+                      <a:extLst>
+                        <a:ext uri="{96DAC541-7B7A-43D3-8B79-37D633B846F1}">
+                          <asvg:svgBlip xmlns:asvg="http://schemas.microsoft.com/office/drawing/2016/SVG/main" r:embed="rId11"/>
+                        </a:ext>
+                      </a:extLst>
+                    </a:blip>
+                    <a:srcRect/>
+                    <a:stretch>
+                      <a:fillRect/>
+                    </a:stretch>
+                  </pic:blipFill>
+                  <pic:spPr bwMode="auto">
+                    <a:xfrm>
+                      <a:off x="0" y="0"/>
+                      <a:ext cx="7560000" cy="10692000"/>
+                    </a:xfrm>
+                    <a:prstGeom prst="rect">
+                      <a:avLst/>
+                    </a:prstGeom>
+                  </pic:spPr>
+                </pic:pic>
+              </a:graphicData>
+            </a:graphic>
+          </wp:anchor>
+        </w:drawing>
+      </w:r>
+    </w:p>
     <w:tbl>
       <w:tblPr>
         <w:tblW w:type="dxa" w:w="9638"/>
@@ -18,8 +77,7 @@
       </w:tblPr>
       <w:tblGrid>
         <w:gridCol w:w="4819"/>
-        <w:gridCol w:w="1134"/>
-        <w:gridCol w:w="3685"/>
+        <w:gridCol w:w="4819"/>
       </w:tblGrid>
       <w:tr>
         <w:trPr>
@@ -112,7 +170,7 @@
         </w:tc>
         <w:tc>
           <w:tcPr>
-            <w:tcW w:type="dxa" w:w="1134"/>
+            <w:tcW w:type="dxa" w:w="4819"/>
             <w:tcBorders>
               <w:top w:val="none" w:color="FFFFFF" w:sz="0"/>
               <w:left w:val="none" w:color="FFFFFF" w:sz="0"/>
@@ -121,25 +179,7 @@
             </w:tcBorders>
             <w:tcMar>
               <w:top w:type="dxa" w:w="0"/>
-              <w:left w:type="dxa" w:w="0"/>
-              <w:bottom w:type="dxa" w:w="0"/>
-              <w:right w:type="dxa" w:w="0"/>
-            </w:tcMar>
-          </w:tcPr>
-          <w:p/>
-        </w:tc>
-        <w:tc>
-          <w:tcPr>
-            <w:tcW w:type="dxa" w:w="3685"/>
-            <w:tcBorders>
-              <w:top w:val="none" w:color="FFFFFF" w:sz="0"/>
-              <w:left w:val="none" w:color="FFFFFF" w:sz="0"/>
-              <w:bottom w:val="none" w:color="FFFFFF" w:sz="0"/>
-              <w:right w:val="none" w:color="FFFFFF" w:sz="0"/>
-            </w:tcBorders>
-            <w:tcMar>
-              <w:top w:type="dxa" w:w="0"/>
-              <w:left w:type="dxa" w:w="0"/>
+              <w:left w:type="dxa" w:w="1134"/>
               <w:bottom w:type="dxa" w:w="0"/>
               <w:right w:type="dxa" w:w="0"/>
             </w:tcMar>
@@ -290,122 +330,68 @@
     <w:p>
       <w:pPr>
         <w:keepNext/>
+        <w:keepLines/>
+        <w:tabs>
+          <w:tab w:val="left" w:pos="4677"/>
+        </w:tabs>
         <w:spacing w:after="0" w:before="280" w:line="280" w:lineRule="exact"/>
       </w:pPr>
       <w:r>
         <w:t xml:space="preserve">Mit freundlichen Grüßen</w:t>
       </w:r>
     </w:p>
-    <w:tbl>
-      <w:tblPr>
-        <w:tblW w:type="dxa" w:w="9354"/>
-        <w:tblBorders>
-          <w:top w:val="none" w:color="FFFFFF" w:sz="0"/>
-          <w:left w:val="none" w:color="FFFFFF" w:sz="0"/>
-          <w:bottom w:val="none" w:color="FFFFFF" w:sz="0"/>
-          <w:right w:val="none" w:color="FFFFFF" w:sz="0"/>
-          <w:insideH w:val="none" w:color="FFFFFF" w:sz="0"/>
-          <w:insideV w:val="none" w:color="FFFFFF" w:sz="0"/>
-        </w:tblBorders>
-        <w:tblLayout w:type="fixed"/>
-      </w:tblPr>
-      <w:tblGrid>
-        <w:gridCol w:w="4677"/>
-        <w:gridCol w:w="4677"/>
-      </w:tblGrid>
-      <w:tr>
-        <w:trPr>
-          <w:cantSplit/>
-        </w:trPr>
-        <w:tc>
-          <w:tcPr>
-            <w:tcW w:type="dxa" w:w="4677"/>
-            <w:tcBorders>
-              <w:top w:val="none" w:color="FFFFFF" w:sz="0"/>
-              <w:left w:val="none" w:color="FFFFFF" w:sz="0"/>
-              <w:bottom w:val="none" w:color="FFFFFF" w:sz="0"/>
-              <w:right w:val="none" w:color="FFFFFF" w:sz="0"/>
-            </w:tcBorders>
-            <w:tcMar>
-              <w:top w:type="dxa" w:w="0"/>
-              <w:left w:type="dxa" w:w="0"/>
-              <w:bottom w:type="dxa" w:w="0"/>
-              <w:right w:type="dxa" w:w="0"/>
-            </w:tcMar>
-          </w:tcPr>
-          <w:p>
-            <w:pPr>
-              <w:spacing w:after="0" w:before="0" w:line="280" w:lineRule="exact"/>
-            </w:pPr>
-          </w:p>
-          <w:p>
-            <w:pPr>
-              <w:spacing w:after="0" w:before="0" w:line="280" w:lineRule="exact"/>
-            </w:pPr>
-          </w:p>
-          <w:p>
-            <w:pPr>
-              <w:spacing w:after="0" w:before="0" w:line="280" w:lineRule="exact"/>
-            </w:pPr>
-          </w:p>
-          <w:p>
-            <w:pPr>
-              <w:spacing w:after="0" w:before="0" w:line="280" w:lineRule="exact"/>
-            </w:pPr>
-            <w:r>
-              <w:t xml:space="preserve">P Knopp</w:t>
-            </w:r>
-          </w:p>
-        </w:tc>
-        <w:tc>
-          <w:tcPr>
-            <w:tcW w:type="dxa" w:w="4677"/>
-            <w:tcBorders>
-              <w:top w:val="none" w:color="FFFFFF" w:sz="0"/>
-              <w:left w:val="none" w:color="FFFFFF" w:sz="0"/>
-              <w:bottom w:val="none" w:color="FFFFFF" w:sz="0"/>
-              <w:right w:val="none" w:color="FFFFFF" w:sz="0"/>
-            </w:tcBorders>
-            <w:tcMar>
-              <w:top w:type="dxa" w:w="0"/>
-              <w:left w:type="dxa" w:w="0"/>
-              <w:bottom w:type="dxa" w:w="0"/>
-              <w:right w:type="dxa" w:w="0"/>
-            </w:tcMar>
-          </w:tcPr>
-          <w:p>
-            <w:pPr>
-              <w:spacing w:after="0" w:before="0" w:line="280" w:lineRule="exact"/>
-            </w:pPr>
-          </w:p>
-          <w:p>
-            <w:pPr>
-              <w:spacing w:after="0" w:before="0" w:line="280" w:lineRule="exact"/>
-            </w:pPr>
-          </w:p>
-          <w:p>
-            <w:pPr>
-              <w:spacing w:after="0" w:before="0" w:line="280" w:lineRule="exact"/>
-            </w:pPr>
-          </w:p>
-          <w:p>
-            <w:pPr>
-              <w:spacing w:after="0" w:before="0" w:line="280" w:lineRule="exact"/>
-            </w:pPr>
-            <w:r>
-              <w:t xml:space="preserve">M Vaghani</w:t>
-            </w:r>
-          </w:p>
-        </w:tc>
-      </w:tr>
-    </w:tbl>
+    <w:p>
+      <w:pPr>
+        <w:keepNext/>
+        <w:keepLines/>
+        <w:tabs>
+          <w:tab w:val="left" w:pos="4677"/>
+        </w:tabs>
+        <w:spacing w:after="0" w:before="0" w:line="280" w:lineRule="exact"/>
+      </w:pPr>
+    </w:p>
+    <w:p>
+      <w:pPr>
+        <w:keepNext/>
+        <w:keepLines/>
+        <w:tabs>
+          <w:tab w:val="left" w:pos="4677"/>
+        </w:tabs>
+        <w:spacing w:after="0" w:before="0" w:line="280" w:lineRule="exact"/>
+      </w:pPr>
+    </w:p>
+    <w:p>
+      <w:pPr>
+        <w:keepNext/>
+        <w:keepLines/>
+        <w:tabs>
+          <w:tab w:val="left" w:pos="4677"/>
+        </w:tabs>
+        <w:spacing w:after="0" w:before="0" w:line="280" w:lineRule="exact"/>
+      </w:pPr>
+    </w:p>
+    <w:p>
+      <w:pPr>
+        <w:keepNext/>
+        <w:keepLines/>
+        <w:tabs>
+          <w:tab w:val="left" w:pos="4677"/>
+        </w:tabs>
+        <w:spacing w:after="0" w:before="0" w:line="280" w:lineRule="exact"/>
+      </w:pPr>
+      <w:r>
+        <w:t xml:space="preserve">P Knopp</w:t>
+        <w:t xml:space="preserve">	</w:t>
+        <w:t xml:space="preserve">M Vaghani</w:t>
+      </w:r>
+    </w:p>
     <w:sectPr>
       <w:headerReference w:type="default" r:id="rId7"/>
       <w:headerReference w:type="first" r:id="rId8"/>
       <w:footerReference w:type="default" r:id="rId9"/>
       <w:footerReference w:type="first" r:id="rId10"/>
       <w:pgSz w:w="11906" w:h="16838" w:orient="portrait"/>
-      <w:pgMar w:top="2551" w:right="1134" w:bottom="1247" w:left="1417" w:header="411" w:footer="454" w:gutter="0"/>
+      <w:pgMar w:top="2531" w:right="1134" w:bottom="1247" w:left="1417" w:header="411" w:footer="454" w:gutter="0"/>
       <w:pgNumType/>
       <w:titlePg/>
       <w:docGrid w:linePitch="360"/>
@@ -677,68 +663,7 @@
 
 <file path=word/header2.xml><?xml version="1.0" encoding="utf-8"?>
 <w:hdr xmlns:wpc="http://schemas.microsoft.com/office/word/2010/wordprocessingCanvas" xmlns:mc="http://schemas.openxmlformats.org/markup-compatibility/2006" xmlns:o="urn:schemas-microsoft-com:office:office" xmlns:r="http://schemas.openxmlformats.org/officeDocument/2006/relationships" xmlns:m="http://schemas.openxmlformats.org/officeDocument/2006/math" xmlns:v="urn:schemas-microsoft-com:vml" xmlns:wp14="http://schemas.microsoft.com/office/word/2010/wordprocessingDrawing" xmlns:wp="http://schemas.openxmlformats.org/drawingml/2006/wordprocessingDrawing" xmlns:w10="urn:schemas-microsoft-com:office:word" xmlns:w="http://schemas.openxmlformats.org/wordprocessingml/2006/main" xmlns:w14="http://schemas.microsoft.com/office/word/2010/wordml" xmlns:w15="http://schemas.microsoft.com/office/word/2012/wordml" xmlns:wpg="http://schemas.microsoft.com/office/word/2010/wordprocessingGroup" xmlns:wpi="http://schemas.microsoft.com/office/word/2010/wordprocessingInk" xmlns:wne="http://schemas.microsoft.com/office/word/2006/wordml" xmlns:wps="http://schemas.microsoft.com/office/word/2010/wordprocessingShape" xmlns:cx="http://schemas.microsoft.com/office/drawing/2014/chartex" xmlns:cx1="http://schemas.microsoft.com/office/drawing/2015/9/8/chartex" xmlns:cx2="http://schemas.microsoft.com/office/drawing/2015/10/21/chartex" xmlns:cx3="http://schemas.microsoft.com/office/drawing/2016/5/9/chartex" xmlns:cx4="http://schemas.microsoft.com/office/drawing/2016/5/10/chartex" xmlns:cx5="http://schemas.microsoft.com/office/drawing/2016/5/11/chartex" xmlns:cx6="http://schemas.microsoft.com/office/drawing/2016/5/12/chartex" xmlns:cx7="http://schemas.microsoft.com/office/drawing/2016/5/13/chartex" xmlns:cx8="http://schemas.microsoft.com/office/drawing/2016/5/14/chartex" xmlns:w16cid="http://schemas.microsoft.com/office/word/2016/wordml/cid" xmlns:w16se="http://schemas.microsoft.com/office/word/2015/wordml/symex">
-  <w:p>
-    <w:pPr>
-      <w:tabs>
-        <w:tab w:val="right" w:pos="9354"/>
-      </w:tabs>
-      <w:spacing w:after="0" w:before="0" w:line="200" w:lineRule="exact"/>
-    </w:pPr>
-    <w:r>
-      <w:drawing>
-        <wp:anchor distT="0" distB="0" distL="0" distR="0" simplePos="0" allowOverlap="1" behindDoc="1" locked="1" layoutInCell="1" relativeHeight="10692000">
-          <wp:simplePos x="0" y="0"/>
-          <wp:positionH relativeFrom="page">
-            <wp:posOffset>0</wp:posOffset>
-          </wp:positionH>
-          <wp:positionV relativeFrom="page">
-            <wp:posOffset>0</wp:posOffset>
-          </wp:positionV>
-          <wp:extent cx="7560000" cy="10692000"/>
-          <wp:effectExtent t="0" r="0" b="0" l="0"/>
-          <wp:wrapNone/>
-          <wp:docPr id="1" name="nocturne-seite1" descr="Briefkopf und Fußzeile NexBridge-IT mit Falz- und Lochmarken" title="NexBridge-IT"/>
-          <wp:cNvGraphicFramePr>
-            <a:graphicFrameLocks xmlns:a="http://schemas.openxmlformats.org/drawingml/2006/main" noChangeAspect="1"/>
-          </wp:cNvGraphicFramePr>
-          <a:graphic xmlns:a="http://schemas.openxmlformats.org/drawingml/2006/main">
-            <a:graphicData uri="http://schemas.openxmlformats.org/drawingml/2006/picture">
-              <pic:pic xmlns:pic="http://schemas.openxmlformats.org/drawingml/2006/picture">
-                <pic:nvPicPr>
-                  <pic:cNvPr id="0" name="" descr=""/>
-                  <pic:cNvPicPr>
-                    <a:picLocks noChangeAspect="1" noChangeArrowheads="1"/>
-                  </pic:cNvPicPr>
-                </pic:nvPicPr>
-                <pic:blipFill>
-                  <a:blip r:embed="rId1" cstate="none">
-                    <a:extLst>
-                      <a:ext uri="{96DAC541-7B7A-43D3-8B79-37D633B846F1}">
-                        <asvg:svgBlip xmlns:asvg="http://schemas.microsoft.com/office/drawing/2016/SVG/main" r:embed="rId0"/>
-                      </a:ext>
-                    </a:extLst>
-                  </a:blip>
-                  <a:srcRect/>
-                  <a:stretch>
-                    <a:fillRect/>
-                  </a:stretch>
-                </pic:blipFill>
-                <pic:spPr bwMode="auto">
-                  <a:xfrm>
-                    <a:off x="0" y="0"/>
-                    <a:ext cx="7560000" cy="10692000"/>
-                  </a:xfrm>
-                  <a:prstGeom prst="rect">
-                    <a:avLst/>
-                  </a:prstGeom>
-                </pic:spPr>
-              </pic:pic>
-            </a:graphicData>
-          </a:graphic>
-        </wp:anchor>
-      </w:drawing>
-    </w:r>
-  </w:p>
+  <w:p/>
 </w:hdr>
 </file>
 

</xml_diff>